<commit_message>
Implement SaaS plan lifecycle enforcement
Add 7-day trial expiry, paid plan renewal blocking, plan-gated modules, superadmin tenant lifecycle controls, and refreshed guide exports.

Co-authored-by: Cursor <cursoragent@cursor.com>
</commit_message>
<xml_diff>
--- a/docs/NEXUSCRM_DEVELOPER_GUIDE.docx
+++ b/docs/NEXUSCRM_DEVELOPER_GUIDE.docx
@@ -15076,7 +15076,7 @@
           <w:rFonts w:ascii="Consolas" w:hAnsi="Consolas"/>
           <w:sz w:val="18"/>
         </w:rPr>
-        <w:t>DEFAULT_TRIAL_DAYS=14</w:t>
+        <w:t>DEFAULT_TRIAL_DAYS=7</w:t>
       </w:r>
     </w:p>
     <w:p>
@@ -16205,7 +16205,7 @@
         </w:rPr>
         <w:t>REQUEST_BODY_LIMIT=12mb</w:t>
         <w:br/>
-        <w:t>DEFAULT_TRIAL_DAYS=14</w:t>
+        <w:t>DEFAULT_TRIAL_DAYS=7</w:t>
         <w:br/>
         <w:t>DNS_SERVERS=1.1.1.1,8.8.8.8</w:t>
       </w:r>

</xml_diff>